<commit_message>
Complete measured MIRACL lab artifacts
</commit_message>
<xml_diff>
--- a/report/Lab1_MIRACL_final.docx
+++ b/report/Lab1_MIRACL_final.docx
@@ -2731,6 +2731,11 @@
     </w:p>
     <w:p>
       <w:r>
+        <w:t>Изоляция выполнена по query_id, docid и текстам, а не по статьям Wikipedia целиком. Независимый аудит обнаружил одну общую статью между train и test при разных непохожих пассажах. Утечки одинаковой пары нет, но полностью независимый перенос на новые статьи этим разбиением не проверяется.</w:t>
+      </w:r>
+    </w:p>
+    <w:p>
+      <w:r>
         <w:t>В сохранённых данных тексты полные. Модель видит не более 900 символов пассажа; общий бюджет текстов — 14 000 символов. Заголовки ограничены 120 символами. У всех моделей одинаковые фрагменты и один детерминированно перемешанный порядок. Усечение может удалить ответ из конца документа; анализ ошибок отдельно учитывает исходную длину.</w:t>
       </w:r>
     </w:p>
@@ -15809,6 +15814,11 @@
       </w:tr>
     </w:tbl>
     <w:p/>
+    <w:p>
+      <w:r>
+        <w:t>В LoRA-контроле при лимите 256 токенов усечено 92,1% тестовых пассажей. Инструкция и вопрос сохраняются, но модель часто видит лишь начало фрагмента. Это существенное ограничение переноса и дополнительная причина не сравнивать его напрямую с основным опытом.</w:t>
+      </w:r>
+    </w:p>
     <w:p>
       <w:r>
         <w:t>Выполнено 64 шагов; обучаемых параметров 540,672 из 494,573,440. Обучение заняло 9,8 с на cuda. Наблюдаемый максимум RSS процесса 1,58 ГиБ; это оперативная память, а не VRAM.</w:t>

</xml_diff>